<commit_message>
Excluye los ids de hallazgos de Sonar del escaneo de gitleaks
</commit_message>
<xml_diff>
--- a/docs/rubrica.docx
+++ b/docs/rubrica.docx
@@ -1769,7 +1769,15 @@
         <w:jc w:val="both"/>
       </w:pPr>
       <w:r>
-        <w:t>El job seguridad añade lo que pide el punto 3: gitleaks sobre todo el historial, CodeQL</w:t>
+        <w:t>El job seguridad añade lo que pide el punto 3: gitleaks sobre todo el historial —con una</w:t>
+      </w:r>
+    </w:p>
+    <w:p>
+      <w:pPr>
+        <w:jc w:val="both"/>
+      </w:pPr>
+      <w:r>
+        <w:t>excepción documentada en .gitleaks.toml para los identificadores de hallazgos de SonarQube—, CodeQL</w:t>
       </w:r>
     </w:p>
     <w:p>

</xml_diff>

<commit_message>
Documenta la verificacion del entorno de prueba desplegado
</commit_message>
<xml_diff>
--- a/docs/rubrica.docx
+++ b/docs/rubrica.docx
@@ -1883,7 +1883,7 @@
         <w:jc w:val="both"/>
       </w:pPr>
       <w:r>
-        <w:t>Evidencia: evidencias/pipeline-exitoso.png, evidencias/despliegue.png y el enlace a la</w:t>
+        <w:t>Verificación hecha el 20 de septiembre de 2026. Con los artefactos que publicó la ejecución</w:t>
       </w:r>
     </w:p>
     <w:p>
@@ -1891,7 +1891,55 @@
         <w:jc w:val="both"/>
       </w:pPr>
       <w:r>
-        <w:t>ejecución en GitHub Actions.</w:t>
+        <w:t>35495568857, sin</w:t>
+      </w:r>
+    </w:p>
+    <w:p>
+      <w:pPr>
+        <w:jc w:val="both"/>
+      </w:pPr>
+      <w:r>
+        <w:t>compilar nada: docker compose up -d bajó ghcr.io/axiuz/tupastilla-api:latest, migró y sembró</w:t>
+      </w:r>
+    </w:p>
+    <w:p>
+      <w:pPr>
+        <w:jc w:val="both"/>
+      </w:pPr>
+      <w:r>
+        <w:t>MySQL y respondió {"status":"ok"} en /health y 401 en /api/me sin token; el APK del release</w:t>
+      </w:r>
+    </w:p>
+    <w:p>
+      <w:pPr>
+        <w:jc w:val="both"/>
+      </w:pPr>
+      <w:r>
+        <w:t>build-4 se instaló en el</w:t>
+      </w:r>
+    </w:p>
+    <w:p>
+      <w:pPr>
+        <w:jc w:val="both"/>
+      </w:pPr>
+      <w:r>
+        <w:t>emulador y la cuenta creada desde la app quedó en MySQL con hash bcrypt de coste 12.</w:t>
+      </w:r>
+    </w:p>
+    <w:p>
+      <w:pPr>
+        <w:jc w:val="both"/>
+      </w:pPr>
+      <w:r>
+        <w:t>Evidencia: evidencias/despliegue-apk-en-emulador.png (APK del release corriendo contra esa</w:t>
+      </w:r>
+    </w:p>
+    <w:p>
+      <w:pPr>
+        <w:jc w:val="both"/>
+      </w:pPr>
+      <w:r>
+        <w:t>API), evidencias/pipeline-exitoso.png y el enlace a la ejecución en GitHub Actions.</w:t>
       </w:r>
     </w:p>
     <w:p/>

</xml_diff>